<commit_message>
Improve failure and iteration documentation
</commit_message>
<xml_diff>
--- a/prompt task (hafsa mahmood).docx
+++ b/prompt task (hafsa mahmood).docx
@@ -448,25 +448,7 @@
           <w:sz w:val="28"/>
           <w:szCs w:val="28"/>
         </w:rPr>
-        <w:t xml:space="preserve">  "</w:t>
-      </w:r>
-      <w:proofErr w:type="gramStart"/>
-      <w:r>
-        <w:rPr>
-          <w:rFonts w:asciiTheme="majorBidi" w:eastAsia="Times New Roman" w:hAnsiTheme="majorBidi" w:cstheme="majorBidi"/>
-          <w:sz w:val="28"/>
-          <w:szCs w:val="28"/>
-        </w:rPr>
-        <w:t>summary</w:t>
-      </w:r>
-      <w:proofErr w:type="gramEnd"/>
-      <w:r>
-        <w:rPr>
-          <w:rFonts w:asciiTheme="majorBidi" w:eastAsia="Times New Roman" w:hAnsiTheme="majorBidi" w:cstheme="majorBidi"/>
-          <w:sz w:val="28"/>
-          <w:szCs w:val="28"/>
-        </w:rPr>
-        <w:t>": "Concise summary of the issue (1 sentence)",</w:t>
+        <w:t xml:space="preserve">  "summary": "Concise summary of the issue (1 sentence)",</w:t>
       </w:r>
     </w:p>
     <w:p>
@@ -4081,7 +4063,6 @@
           <w:szCs w:val="28"/>
         </w:rPr>
       </w:pPr>
-      <w:bookmarkStart w:id="0" w:name="_GoBack"/>
       <w:r>
         <w:rPr>
           <w:rFonts w:asciiTheme="majorBidi" w:eastAsia="Times New Roman" w:hAnsiTheme="majorBidi" w:cstheme="majorBidi"/>
@@ -4131,7 +4112,6 @@
           </wp:inline>
         </w:drawing>
       </w:r>
-      <w:bookmarkEnd w:id="0"/>
     </w:p>
     <w:p>
       <w:pPr>
@@ -4158,286 +4138,319 @@
     </w:p>
     <w:p>
       <w:pPr>
-        <w:numPr>
-          <w:ilvl w:val="0"/>
-          <w:numId w:val="1"/>
-        </w:numPr>
         <w:spacing w:before="100" w:beforeAutospacing="1" w:after="100" w:afterAutospacing="1" w:line="240" w:lineRule="auto"/>
         <w:rPr>
-          <w:rFonts w:asciiTheme="majorBidi" w:eastAsia="Times New Roman" w:hAnsiTheme="majorBidi" w:cstheme="majorBidi"/>
-          <w:sz w:val="28"/>
-          <w:szCs w:val="28"/>
-        </w:rPr>
-      </w:pPr>
-      <w:r>
-        <w:rPr>
-          <w:rFonts w:asciiTheme="majorBidi" w:eastAsia="Times New Roman" w:hAnsiTheme="majorBidi" w:cstheme="majorBidi"/>
+          <w:rFonts w:ascii="Times New Roman" w:eastAsia="Times New Roman" w:hAnsi="Times New Roman" w:cs="Times New Roman"/>
+          <w:sz w:val="24"/>
+          <w:szCs w:val="24"/>
+        </w:rPr>
+      </w:pPr>
+      <w:r>
+        <w:rPr>
+          <w:rFonts w:ascii="Times New Roman" w:eastAsia="Times New Roman" w:hAnsi="Times New Roman" w:cs="Times New Roman"/>
           <w:b/>
           <w:bCs/>
-          <w:sz w:val="28"/>
-          <w:szCs w:val="28"/>
-        </w:rPr>
-        <w:t>Failure 1 (Markdown Block Wrappers):</w:t>
-      </w:r>
-      <w:r>
-        <w:rPr>
-          <w:rFonts w:asciiTheme="majorBidi" w:eastAsia="Times New Roman" w:hAnsiTheme="majorBidi" w:cstheme="majorBidi"/>
-          <w:sz w:val="28"/>
-          <w:szCs w:val="28"/>
-        </w:rPr>
-        <w:t xml:space="preserve"> Model output included </w:t>
-      </w:r>
-      <w:proofErr w:type="spellStart"/>
-      <w:r>
-        <w:rPr>
-          <w:rFonts w:asciiTheme="majorBidi" w:eastAsia="Times New Roman" w:hAnsiTheme="majorBidi" w:cstheme="majorBidi"/>
-          <w:sz w:val="28"/>
-          <w:szCs w:val="28"/>
-        </w:rPr>
-        <w:t>json</w:t>
-      </w:r>
-      <w:proofErr w:type="spellEnd"/>
-      <w:r>
-        <w:rPr>
-          <w:rFonts w:asciiTheme="majorBidi" w:eastAsia="Times New Roman" w:hAnsiTheme="majorBidi" w:cstheme="majorBidi"/>
-          <w:sz w:val="28"/>
-          <w:szCs w:val="28"/>
-        </w:rPr>
-        <w:t xml:space="preserve"> formatting tags, breaking automated program parsing. *Fix Applied:* Added strict constraint in prompt: *"Do not include markdown formatting blocks (like </w:t>
-      </w:r>
-      <w:proofErr w:type="spellStart"/>
-      <w:r>
-        <w:rPr>
-          <w:rFonts w:asciiTheme="majorBidi" w:eastAsia="Times New Roman" w:hAnsiTheme="majorBidi" w:cstheme="majorBidi"/>
-          <w:sz w:val="28"/>
-          <w:szCs w:val="28"/>
-        </w:rPr>
-        <w:t>json</w:t>
-      </w:r>
-      <w:proofErr w:type="spellEnd"/>
-      <w:r>
-        <w:rPr>
-          <w:rFonts w:asciiTheme="majorBidi" w:eastAsia="Times New Roman" w:hAnsiTheme="majorBidi" w:cstheme="majorBidi"/>
-          <w:sz w:val="28"/>
-          <w:szCs w:val="28"/>
-        </w:rPr>
-        <w:t>)."*</w:t>
-      </w:r>
-    </w:p>
-    <w:p>
-      <w:pPr>
-        <w:numPr>
-          <w:ilvl w:val="0"/>
-          <w:numId w:val="1"/>
-        </w:numPr>
-        <w:spacing w:before="100" w:beforeAutospacing="1" w:after="100" w:afterAutospacing="1" w:line="240" w:lineRule="auto"/>
-        <w:rPr>
-          <w:rFonts w:asciiTheme="majorBidi" w:eastAsia="Times New Roman" w:hAnsiTheme="majorBidi" w:cstheme="majorBidi"/>
-          <w:sz w:val="28"/>
-          <w:szCs w:val="28"/>
-        </w:rPr>
-      </w:pPr>
-      <w:r>
-        <w:rPr>
-          <w:rFonts w:asciiTheme="majorBidi" w:eastAsia="Times New Roman" w:hAnsiTheme="majorBidi" w:cstheme="majorBidi"/>
+          <w:sz w:val="24"/>
+          <w:szCs w:val="24"/>
+        </w:rPr>
+        <w:t>Failure 1 — Markdown Block Wrappers</w:t>
+      </w:r>
+      <w:r>
+        <w:rPr>
+          <w:rFonts w:ascii="Times New Roman" w:eastAsia="Times New Roman" w:hAnsi="Times New Roman" w:cs="Times New Roman"/>
+          <w:sz w:val="24"/>
+          <w:szCs w:val="24"/>
+        </w:rPr>
+        <w:br/>
+      </w:r>
+      <w:r>
+        <w:rPr>
+          <w:rFonts w:ascii="Times New Roman" w:eastAsia="Times New Roman" w:hAnsi="Times New Roman" w:cs="Times New Roman"/>
           <w:b/>
           <w:bCs/>
-          <w:sz w:val="28"/>
-          <w:szCs w:val="28"/>
-        </w:rPr>
-        <w:t xml:space="preserve">Failure 2 (Unconstrained </w:t>
-      </w:r>
-      <w:proofErr w:type="spellStart"/>
-      <w:r>
-        <w:rPr>
-          <w:rFonts w:asciiTheme="majorBidi" w:eastAsia="Times New Roman" w:hAnsiTheme="majorBidi" w:cstheme="majorBidi"/>
+          <w:sz w:val="24"/>
+          <w:szCs w:val="24"/>
+        </w:rPr>
+        <w:t>Problem:</w:t>
+      </w:r>
+      <w:r>
+        <w:rPr>
+          <w:rFonts w:ascii="Times New Roman" w:eastAsia="Times New Roman" w:hAnsi="Times New Roman" w:cs="Times New Roman"/>
+          <w:sz w:val="24"/>
+          <w:szCs w:val="24"/>
+        </w:rPr>
+        <w:t xml:space="preserve"> The model returned JSON inside Markdown formatting blocks, which caused problems with automated parsing.</w:t>
+      </w:r>
+      <w:r>
+        <w:rPr>
+          <w:rFonts w:ascii="Times New Roman" w:eastAsia="Times New Roman" w:hAnsi="Times New Roman" w:cs="Times New Roman"/>
+          <w:sz w:val="24"/>
+          <w:szCs w:val="24"/>
+        </w:rPr>
+        <w:br/>
+      </w:r>
+      <w:r>
+        <w:rPr>
+          <w:rFonts w:ascii="Times New Roman" w:eastAsia="Times New Roman" w:hAnsi="Times New Roman" w:cs="Times New Roman"/>
           <w:b/>
           <w:bCs/>
-          <w:sz w:val="28"/>
-          <w:szCs w:val="28"/>
-        </w:rPr>
-        <w:t>Enums</w:t>
-      </w:r>
-      <w:proofErr w:type="spellEnd"/>
-      <w:r>
-        <w:rPr>
-          <w:rFonts w:asciiTheme="majorBidi" w:eastAsia="Times New Roman" w:hAnsiTheme="majorBidi" w:cstheme="majorBidi"/>
+          <w:sz w:val="24"/>
+          <w:szCs w:val="24"/>
+        </w:rPr>
+        <w:t>Fix Applied:</w:t>
+      </w:r>
+      <w:r>
+        <w:rPr>
+          <w:rFonts w:ascii="Times New Roman" w:eastAsia="Times New Roman" w:hAnsi="Times New Roman" w:cs="Times New Roman"/>
+          <w:sz w:val="24"/>
+          <w:szCs w:val="24"/>
+        </w:rPr>
+        <w:t xml:space="preserve"> Added a strict instruction requiring raw, valid JSON without Markdown formatting.</w:t>
+      </w:r>
+    </w:p>
+    <w:p>
+      <w:pPr>
+        <w:spacing w:before="100" w:beforeAutospacing="1" w:after="100" w:afterAutospacing="1" w:line="240" w:lineRule="auto"/>
+        <w:rPr>
+          <w:rFonts w:ascii="Times New Roman" w:eastAsia="Times New Roman" w:hAnsi="Times New Roman" w:cs="Times New Roman"/>
+          <w:sz w:val="24"/>
+          <w:szCs w:val="24"/>
+        </w:rPr>
+      </w:pPr>
+      <w:r>
+        <w:rPr>
+          <w:rFonts w:ascii="Times New Roman" w:eastAsia="Times New Roman" w:hAnsi="Times New Roman" w:cs="Times New Roman"/>
           <w:b/>
           <w:bCs/>
-          <w:sz w:val="28"/>
-          <w:szCs w:val="28"/>
-        </w:rPr>
-        <w:t>):</w:t>
-      </w:r>
-      <w:r>
-        <w:rPr>
-          <w:rFonts w:asciiTheme="majorBidi" w:eastAsia="Times New Roman" w:hAnsiTheme="majorBidi" w:cstheme="majorBidi"/>
-          <w:sz w:val="28"/>
-          <w:szCs w:val="28"/>
-        </w:rPr>
-        <w:t xml:space="preserve"> Model returned dynamic categories like "Emergency" or "Access Control".</w:t>
-      </w:r>
-    </w:p>
-    <w:p>
-      <w:pPr>
-        <w:spacing w:before="100" w:beforeAutospacing="1" w:after="100" w:afterAutospacing="1" w:line="240" w:lineRule="auto"/>
-        <w:ind w:left="720"/>
-        <w:rPr>
-          <w:rFonts w:asciiTheme="majorBidi" w:eastAsia="Times New Roman" w:hAnsiTheme="majorBidi" w:cstheme="majorBidi"/>
-          <w:sz w:val="28"/>
-          <w:szCs w:val="28"/>
-        </w:rPr>
-      </w:pPr>
-      <w:r>
-        <w:rPr>
-          <w:rFonts w:asciiTheme="majorBidi" w:eastAsia="Times New Roman" w:hAnsiTheme="majorBidi" w:cstheme="majorBidi"/>
-          <w:i/>
-          <w:iCs/>
-          <w:sz w:val="28"/>
-          <w:szCs w:val="28"/>
-        </w:rPr>
-        <w:t>Fix Applied:</w:t>
-      </w:r>
-      <w:r>
-        <w:rPr>
-          <w:rFonts w:asciiTheme="majorBidi" w:eastAsia="Times New Roman" w:hAnsiTheme="majorBidi" w:cstheme="majorBidi"/>
-          <w:sz w:val="28"/>
-          <w:szCs w:val="28"/>
-        </w:rPr>
-        <w:t xml:space="preserve"> Standardized allowed categories strictly: "Billing | Technical Support | Account Access | Feature Request | General Inquiry".</w:t>
-      </w:r>
-    </w:p>
-    <w:p>
-      <w:pPr>
-        <w:numPr>
-          <w:ilvl w:val="0"/>
-          <w:numId w:val="1"/>
-        </w:numPr>
-        <w:spacing w:before="100" w:beforeAutospacing="1" w:after="100" w:afterAutospacing="1" w:line="240" w:lineRule="auto"/>
-        <w:rPr>
-          <w:rFonts w:asciiTheme="majorBidi" w:eastAsia="Times New Roman" w:hAnsiTheme="majorBidi" w:cstheme="majorBidi"/>
-          <w:sz w:val="28"/>
-          <w:szCs w:val="28"/>
-        </w:rPr>
-      </w:pPr>
-      <w:r>
-        <w:rPr>
-          <w:rFonts w:asciiTheme="majorBidi" w:eastAsia="Times New Roman" w:hAnsiTheme="majorBidi" w:cstheme="majorBidi"/>
+          <w:sz w:val="24"/>
+          <w:szCs w:val="24"/>
+        </w:rPr>
+        <w:t xml:space="preserve">Failure 2 — Unconstrained </w:t>
+      </w:r>
+      <w:proofErr w:type="spellStart"/>
+      <w:r>
+        <w:rPr>
+          <w:rFonts w:ascii="Times New Roman" w:eastAsia="Times New Roman" w:hAnsi="Times New Roman" w:cs="Times New Roman"/>
           <w:b/>
           <w:bCs/>
-          <w:sz w:val="28"/>
-          <w:szCs w:val="28"/>
-        </w:rPr>
-        <w:t>Failure 3 (Omitted Missing Keys):</w:t>
-      </w:r>
-      <w:r>
-        <w:rPr>
-          <w:rFonts w:asciiTheme="majorBidi" w:eastAsia="Times New Roman" w:hAnsiTheme="majorBidi" w:cstheme="majorBidi"/>
-          <w:sz w:val="28"/>
-          <w:szCs w:val="28"/>
-        </w:rPr>
-        <w:t xml:space="preserve"> Model removed missing JSON keys entirely instead of assigning null.</w:t>
-      </w:r>
-    </w:p>
-    <w:p>
-      <w:pPr>
-        <w:spacing w:before="100" w:beforeAutospacing="1" w:after="100" w:afterAutospacing="1" w:line="240" w:lineRule="auto"/>
-        <w:ind w:left="720"/>
-        <w:rPr>
-          <w:rFonts w:asciiTheme="majorBidi" w:eastAsia="Times New Roman" w:hAnsiTheme="majorBidi" w:cstheme="majorBidi"/>
-          <w:sz w:val="28"/>
-          <w:szCs w:val="28"/>
-        </w:rPr>
-      </w:pPr>
-      <w:r>
-        <w:rPr>
-          <w:rFonts w:asciiTheme="majorBidi" w:eastAsia="Times New Roman" w:hAnsiTheme="majorBidi" w:cstheme="majorBidi"/>
-          <w:i/>
-          <w:iCs/>
-          <w:sz w:val="28"/>
-          <w:szCs w:val="28"/>
-        </w:rPr>
-        <w:lastRenderedPageBreak/>
-        <w:t>Fix Applied:</w:t>
-      </w:r>
-      <w:r>
-        <w:rPr>
-          <w:rFonts w:asciiTheme="majorBidi" w:eastAsia="Times New Roman" w:hAnsiTheme="majorBidi" w:cstheme="majorBidi"/>
-          <w:sz w:val="28"/>
-          <w:szCs w:val="28"/>
-        </w:rPr>
-        <w:t xml:space="preserve"> Added instruction: </w:t>
-      </w:r>
-      <w:r>
-        <w:rPr>
-          <w:rFonts w:asciiTheme="majorBidi" w:eastAsia="Times New Roman" w:hAnsiTheme="majorBidi" w:cstheme="majorBidi"/>
-          <w:i/>
-          <w:iCs/>
-          <w:sz w:val="28"/>
-          <w:szCs w:val="28"/>
-        </w:rPr>
-        <w:t>"If a field is not present in the text, assign null explicitly."</w:t>
-      </w:r>
-    </w:p>
-    <w:p>
-      <w:pPr>
-        <w:numPr>
-          <w:ilvl w:val="0"/>
-          <w:numId w:val="1"/>
-        </w:numPr>
-        <w:spacing w:before="100" w:beforeAutospacing="1" w:after="100" w:afterAutospacing="1" w:line="240" w:lineRule="auto"/>
-        <w:rPr>
-          <w:rFonts w:asciiTheme="majorBidi" w:eastAsia="Times New Roman" w:hAnsiTheme="majorBidi" w:cstheme="majorBidi"/>
-          <w:sz w:val="28"/>
-          <w:szCs w:val="28"/>
-        </w:rPr>
-      </w:pPr>
-      <w:r>
-        <w:rPr>
-          <w:rFonts w:asciiTheme="majorBidi" w:eastAsia="Times New Roman" w:hAnsiTheme="majorBidi" w:cstheme="majorBidi"/>
+          <w:sz w:val="24"/>
+          <w:szCs w:val="24"/>
+        </w:rPr>
+        <w:t>Enums</w:t>
+      </w:r>
+      <w:proofErr w:type="spellEnd"/>
+      <w:r>
+        <w:rPr>
+          <w:rFonts w:ascii="Times New Roman" w:eastAsia="Times New Roman" w:hAnsi="Times New Roman" w:cs="Times New Roman"/>
+          <w:sz w:val="24"/>
+          <w:szCs w:val="24"/>
+        </w:rPr>
+        <w:br/>
+      </w:r>
+      <w:r>
+        <w:rPr>
+          <w:rFonts w:ascii="Times New Roman" w:eastAsia="Times New Roman" w:hAnsi="Times New Roman" w:cs="Times New Roman"/>
           <w:b/>
           <w:bCs/>
-          <w:sz w:val="28"/>
-          <w:szCs w:val="28"/>
-        </w:rPr>
-        <w:t>Failure 4 (Urgency Misclassification):</w:t>
-      </w:r>
-      <w:r>
-        <w:rPr>
-          <w:rFonts w:asciiTheme="majorBidi" w:eastAsia="Times New Roman" w:hAnsiTheme="majorBidi" w:cstheme="majorBidi"/>
-          <w:sz w:val="28"/>
-          <w:szCs w:val="28"/>
-        </w:rPr>
-        <w:t xml:space="preserve"> Critical security endpoint vulnerabilities were initially flagged as Medium.</w:t>
+          <w:sz w:val="24"/>
+          <w:szCs w:val="24"/>
+        </w:rPr>
+        <w:t>Problem:</w:t>
+      </w:r>
+      <w:r>
+        <w:rPr>
+          <w:rFonts w:ascii="Times New Roman" w:eastAsia="Times New Roman" w:hAnsi="Times New Roman" w:cs="Times New Roman"/>
+          <w:sz w:val="24"/>
+          <w:szCs w:val="24"/>
+        </w:rPr>
+        <w:t xml:space="preserve"> The model generated categories outside the allowed category list, such as “Emergency” or “Access Control.”</w:t>
+      </w:r>
+      <w:r>
+        <w:rPr>
+          <w:rFonts w:ascii="Times New Roman" w:eastAsia="Times New Roman" w:hAnsi="Times New Roman" w:cs="Times New Roman"/>
+          <w:sz w:val="24"/>
+          <w:szCs w:val="24"/>
+        </w:rPr>
+        <w:br/>
+      </w:r>
+      <w:r>
+        <w:rPr>
+          <w:rFonts w:ascii="Times New Roman" w:eastAsia="Times New Roman" w:hAnsi="Times New Roman" w:cs="Times New Roman"/>
+          <w:b/>
+          <w:bCs/>
+          <w:sz w:val="24"/>
+          <w:szCs w:val="24"/>
+        </w:rPr>
+        <w:t>Fix Applied:</w:t>
+      </w:r>
+      <w:r>
+        <w:rPr>
+          <w:rFonts w:ascii="Times New Roman" w:eastAsia="Times New Roman" w:hAnsi="Times New Roman" w:cs="Times New Roman"/>
+          <w:sz w:val="24"/>
+          <w:szCs w:val="24"/>
+        </w:rPr>
+        <w:t xml:space="preserve"> Restricted the category field to the five specified categories.</w:t>
       </w:r>
     </w:p>
     <w:p>
       <w:pPr>
         <w:spacing w:before="100" w:beforeAutospacing="1" w:after="100" w:afterAutospacing="1" w:line="240" w:lineRule="auto"/>
-        <w:ind w:left="720"/>
-        <w:rPr>
-          <w:rFonts w:asciiTheme="majorBidi" w:eastAsia="Times New Roman" w:hAnsiTheme="majorBidi" w:cstheme="majorBidi"/>
-          <w:sz w:val="28"/>
-          <w:szCs w:val="28"/>
-        </w:rPr>
-      </w:pPr>
-      <w:r>
-        <w:rPr>
-          <w:rFonts w:asciiTheme="majorBidi" w:eastAsia="Times New Roman" w:hAnsiTheme="majorBidi" w:cstheme="majorBidi"/>
-          <w:i/>
-          <w:iCs/>
-          <w:sz w:val="28"/>
-          <w:szCs w:val="28"/>
+        <w:rPr>
+          <w:rFonts w:ascii="Times New Roman" w:eastAsia="Times New Roman" w:hAnsi="Times New Roman" w:cs="Times New Roman"/>
+          <w:sz w:val="24"/>
+          <w:szCs w:val="24"/>
+        </w:rPr>
+      </w:pPr>
+      <w:r>
+        <w:rPr>
+          <w:rFonts w:ascii="Times New Roman" w:eastAsia="Times New Roman" w:hAnsi="Times New Roman" w:cs="Times New Roman"/>
+          <w:b/>
+          <w:bCs/>
+          <w:sz w:val="24"/>
+          <w:szCs w:val="24"/>
+        </w:rPr>
+        <w:t>Failure 3 — Omitted Missing Keys</w:t>
+      </w:r>
+      <w:r>
+        <w:rPr>
+          <w:rFonts w:ascii="Times New Roman" w:eastAsia="Times New Roman" w:hAnsi="Times New Roman" w:cs="Times New Roman"/>
+          <w:sz w:val="24"/>
+          <w:szCs w:val="24"/>
+        </w:rPr>
+        <w:br/>
+      </w:r>
+      <w:r>
+        <w:rPr>
+          <w:rFonts w:ascii="Times New Roman" w:eastAsia="Times New Roman" w:hAnsi="Times New Roman" w:cs="Times New Roman"/>
+          <w:b/>
+          <w:bCs/>
+          <w:sz w:val="24"/>
+          <w:szCs w:val="24"/>
+        </w:rPr>
+        <w:t>Problem:</w:t>
+      </w:r>
+      <w:r>
+        <w:rPr>
+          <w:rFonts w:ascii="Times New Roman" w:eastAsia="Times New Roman" w:hAnsi="Times New Roman" w:cs="Times New Roman"/>
+          <w:sz w:val="24"/>
+          <w:szCs w:val="24"/>
+        </w:rPr>
+        <w:t xml:space="preserve"> The model sometimes removed fields when information was not provided.</w:t>
+      </w:r>
+      <w:r>
+        <w:rPr>
+          <w:rFonts w:ascii="Times New Roman" w:eastAsia="Times New Roman" w:hAnsi="Times New Roman" w:cs="Times New Roman"/>
+          <w:sz w:val="24"/>
+          <w:szCs w:val="24"/>
+        </w:rPr>
+        <w:br/>
+      </w:r>
+      <w:r>
+        <w:rPr>
+          <w:rFonts w:ascii="Times New Roman" w:eastAsia="Times New Roman" w:hAnsi="Times New Roman" w:cs="Times New Roman"/>
+          <w:b/>
+          <w:bCs/>
+          <w:sz w:val="24"/>
+          <w:szCs w:val="24"/>
         </w:rPr>
         <w:t>Fix Applied:</w:t>
       </w:r>
       <w:r>
         <w:rPr>
-          <w:rFonts w:asciiTheme="majorBidi" w:eastAsia="Times New Roman" w:hAnsiTheme="majorBidi" w:cstheme="majorBidi"/>
-          <w:sz w:val="28"/>
-          <w:szCs w:val="28"/>
-        </w:rPr>
-        <w:t xml:space="preserve"> Explicitly defined High urgency rules to include security risks, downtime, and payment errors.</w:t>
+          <w:rFonts w:ascii="Times New Roman" w:eastAsia="Times New Roman" w:hAnsi="Times New Roman" w:cs="Times New Roman"/>
+          <w:sz w:val="24"/>
+          <w:szCs w:val="24"/>
+        </w:rPr>
+        <w:t xml:space="preserve"> Added an explicit rule requiring missing fields to be returned as </w:t>
+      </w:r>
+      <w:r>
+        <w:rPr>
+          <w:rFonts w:ascii="Courier New" w:eastAsia="Times New Roman" w:hAnsi="Courier New" w:cs="Courier New"/>
+          <w:sz w:val="20"/>
+          <w:szCs w:val="20"/>
+        </w:rPr>
+        <w:t>null</w:t>
+      </w:r>
+      <w:r>
+        <w:rPr>
+          <w:rFonts w:ascii="Times New Roman" w:eastAsia="Times New Roman" w:hAnsi="Times New Roman" w:cs="Times New Roman"/>
+          <w:sz w:val="24"/>
+          <w:szCs w:val="24"/>
+        </w:rPr>
+        <w:t>.</w:t>
+      </w:r>
+    </w:p>
+    <w:p>
+      <w:pPr>
+        <w:spacing w:before="100" w:beforeAutospacing="1" w:after="100" w:afterAutospacing="1" w:line="240" w:lineRule="auto"/>
+        <w:rPr>
+          <w:rFonts w:ascii="Times New Roman" w:eastAsia="Times New Roman" w:hAnsi="Times New Roman" w:cs="Times New Roman"/>
+          <w:sz w:val="24"/>
+          <w:szCs w:val="24"/>
+        </w:rPr>
+      </w:pPr>
+      <w:r>
+        <w:rPr>
+          <w:rFonts w:ascii="Times New Roman" w:eastAsia="Times New Roman" w:hAnsi="Times New Roman" w:cs="Times New Roman"/>
+          <w:b/>
+          <w:bCs/>
+          <w:sz w:val="24"/>
+          <w:szCs w:val="24"/>
+        </w:rPr>
+        <w:lastRenderedPageBreak/>
+        <w:t>Failure 4 — Urgency Misclassification</w:t>
+      </w:r>
+      <w:r>
+        <w:rPr>
+          <w:rFonts w:ascii="Times New Roman" w:eastAsia="Times New Roman" w:hAnsi="Times New Roman" w:cs="Times New Roman"/>
+          <w:sz w:val="24"/>
+          <w:szCs w:val="24"/>
+        </w:rPr>
+        <w:br/>
+      </w:r>
+      <w:r>
+        <w:rPr>
+          <w:rFonts w:ascii="Times New Roman" w:eastAsia="Times New Roman" w:hAnsi="Times New Roman" w:cs="Times New Roman"/>
+          <w:b/>
+          <w:bCs/>
+          <w:sz w:val="24"/>
+          <w:szCs w:val="24"/>
+        </w:rPr>
+        <w:t>Problem:</w:t>
+      </w:r>
+      <w:r>
+        <w:rPr>
+          <w:rFonts w:ascii="Times New Roman" w:eastAsia="Times New Roman" w:hAnsi="Times New Roman" w:cs="Times New Roman"/>
+          <w:sz w:val="24"/>
+          <w:szCs w:val="24"/>
+        </w:rPr>
+        <w:t xml:space="preserve"> Security-related endpoint vulnerabilities were initially classified as Medium instead of High.</w:t>
+      </w:r>
+      <w:r>
+        <w:rPr>
+          <w:rFonts w:ascii="Times New Roman" w:eastAsia="Times New Roman" w:hAnsi="Times New Roman" w:cs="Times New Roman"/>
+          <w:sz w:val="24"/>
+          <w:szCs w:val="24"/>
+        </w:rPr>
+        <w:br/>
+      </w:r>
+      <w:r>
+        <w:rPr>
+          <w:rFonts w:ascii="Times New Roman" w:eastAsia="Times New Roman" w:hAnsi="Times New Roman" w:cs="Times New Roman"/>
+          <w:b/>
+          <w:bCs/>
+          <w:sz w:val="24"/>
+          <w:szCs w:val="24"/>
+        </w:rPr>
+        <w:t>Fix Applied:</w:t>
+      </w:r>
+      <w:r>
+        <w:rPr>
+          <w:rFonts w:ascii="Times New Roman" w:eastAsia="Times New Roman" w:hAnsi="Times New Roman" w:cs="Times New Roman"/>
+          <w:sz w:val="24"/>
+          <w:szCs w:val="24"/>
+        </w:rPr>
+        <w:t xml:space="preserve"> Expanded the High-urgency rules to include security risks, downtime, and payment errors.</w:t>
       </w:r>
     </w:p>
     <w:p>
@@ -4446,6 +4459,8 @@
           <w:rFonts w:asciiTheme="majorBidi" w:hAnsiTheme="majorBidi" w:cstheme="majorBidi"/>
         </w:rPr>
       </w:pPr>
+      <w:bookmarkStart w:id="0" w:name="_GoBack"/>
+      <w:bookmarkEnd w:id="0"/>
     </w:p>
     <w:sectPr>
       <w:pgSz w:w="12240" w:h="15840"/>
@@ -5202,6 +5217,30 @@
       <w:u w:val="single"/>
     </w:rPr>
   </w:style>
+  <w:style w:type="paragraph" w:customStyle="1" w:styleId="pdq2pgselectionanchorcontainer">
+    <w:name w:val="pdq2pg_selectionanchorcontainer"/>
+    <w:basedOn w:val="Normal"/>
+    <w:rsid w:val="000E5246"/>
+    <w:pPr>
+      <w:spacing w:before="100" w:beforeAutospacing="1" w:after="100" w:afterAutospacing="1" w:line="240" w:lineRule="auto"/>
+    </w:pPr>
+    <w:rPr>
+      <w:rFonts w:ascii="Times New Roman" w:eastAsia="Times New Roman" w:hAnsi="Times New Roman" w:cs="Times New Roman"/>
+      <w:sz w:val="24"/>
+      <w:szCs w:val="24"/>
+    </w:rPr>
+  </w:style>
+  <w:style w:type="character" w:styleId="Strong">
+    <w:name w:val="Strong"/>
+    <w:basedOn w:val="DefaultParagraphFont"/>
+    <w:uiPriority w:val="22"/>
+    <w:qFormat/>
+    <w:rsid w:val="000E5246"/>
+    <w:rPr>
+      <w:b/>
+      <w:bCs/>
+    </w:rPr>
+  </w:style>
 </w:styles>
 </file>
 

</xml_diff>